<commit_message>
Corrige truncamento silencioso na Questao 2
O vetor de P2 tinha capacidade fixa de 100000 posicoes e a leitura parava ao
atingir o limite, descartando o restante e encerrando com codigo 0. Um arquivo
com os inteiros de 0 a 100000 relatava 100000 valores distintos em vez de
100001. O vetor agora comeca com 1024 posicoes e dobra com realloc, com
verificacao de falha de alocacao e liberacao ao final.

Verificado: 0 a 100000 passa a relatar 100001, dados.txt continua em 6 e
arquivo vazio retorna 0. Compila sem avisos com -Wall -Wextra.

Co-Authored-By: Claude Opus 5 <noreply@anthropic.com>
Claude-Session: https://claude.ai/code/session_01KSkkYioErqhAMFwHExuSrw
</commit_message>
<xml_diff>
--- a/atividade-2-pipe/Atividade-2-Pipe.docx
+++ b/atividade-2-pipe/Atividade-2-Pipe.docx
@@ -2158,7 +2158,7 @@
           <w:sz w:val="24"/>
           <w:szCs w:val="24"/>
         </w:rPr>
-        <w:t xml:space="preserve">O processo inicial cria os dois pipes antes de qualquer fork e depois executa duas chamadas a fork. P1, o processo original, abre o arquivo texto e envia cada inteiro lido pelo primeiro pipe. P2 recebe os números, armazena em vetor, ordena com qsort e escreve no segundo pipe apenas os valores que diferem do anterior, o que remove as repetições em uma única passagem. P3 conta quantos valores recebeu e imprime o total. Cada processo fecha as pontas que não utiliza, inclusive P3 fechando as duas extremidades do primeiro pipe, sem o que P2 nunca receberia EOF. P1 recolhe os dois filhos com waitpid e informa os códigos de saída.</w:t>
+        <w:t xml:space="preserve">O processo inicial cria os dois pipes antes de qualquer fork e depois executa duas chamadas a fork. P1, o processo original, abre o arquivo texto e envia cada inteiro lido pelo primeiro pipe. P2 recebe os números, armazena em um vetor que dobra de tamanho com realloc sempre que enche, ordena com qsort e escreve no segundo pipe apenas os valores que diferem do anterior, o que remove as repetições em uma única passagem. Sem esse crescimento, um arquivo maior que a capacidade inicial teria valores descartados e a contagem final sairia menor sem nenhum aviso. P3 conta quantos valores recebeu e imprime o total. Cada processo fecha as pontas que não utiliza, inclusive P3 fechando as duas extremidades do primeiro pipe, sem o que P2 nunca receberia EOF. P1 recolhe os dois filhos com waitpid e informa os códigos de saída.</w:t>
       </w:r>
     </w:p>
     <w:p>
@@ -2310,7 +2310,82 @@
           <w:sz w:val="17"/>
           <w:szCs w:val="17"/>
         </w:rPr>
-        <w:t xml:space="preserve">#define MAX 100000</w:t>
+        <w:t xml:space="preserve">static int compara(const void *a, const void *b)</w:t>
+      </w:r>
+    </w:p>
+    <w:p>
+      <w:pPr>
+        <w:shd w:fill="F2F2F2" w:val="clear"/>
+        <w:spacing w:after="0" w:line="220"/>
+        <w:jc w:val="left"/>
+      </w:pPr>
+      <w:r>
+        <w:rPr>
+          <w:rFonts w:ascii="Courier New" w:cs="Courier New" w:eastAsia="Courier New" w:hAnsi="Courier New"/>
+          <w:sz w:val="17"/>
+          <w:szCs w:val="17"/>
+        </w:rPr>
+        <w:t xml:space="preserve">{</w:t>
+      </w:r>
+    </w:p>
+    <w:p>
+      <w:pPr>
+        <w:shd w:fill="F2F2F2" w:val="clear"/>
+        <w:spacing w:after="0" w:line="220"/>
+        <w:jc w:val="left"/>
+      </w:pPr>
+      <w:r>
+        <w:rPr>
+          <w:rFonts w:ascii="Courier New" w:cs="Courier New" w:eastAsia="Courier New" w:hAnsi="Courier New"/>
+          <w:sz w:val="17"/>
+          <w:szCs w:val="17"/>
+        </w:rPr>
+        <w:t xml:space="preserve">    int x = *(const int *) a;</w:t>
+      </w:r>
+    </w:p>
+    <w:p>
+      <w:pPr>
+        <w:shd w:fill="F2F2F2" w:val="clear"/>
+        <w:spacing w:after="0" w:line="220"/>
+        <w:jc w:val="left"/>
+      </w:pPr>
+      <w:r>
+        <w:rPr>
+          <w:rFonts w:ascii="Courier New" w:cs="Courier New" w:eastAsia="Courier New" w:hAnsi="Courier New"/>
+          <w:sz w:val="17"/>
+          <w:szCs w:val="17"/>
+        </w:rPr>
+        <w:t xml:space="preserve">    int y = *(const int *) b;</w:t>
+      </w:r>
+    </w:p>
+    <w:p>
+      <w:pPr>
+        <w:shd w:fill="F2F2F2" w:val="clear"/>
+        <w:spacing w:after="0" w:line="220"/>
+        <w:jc w:val="left"/>
+      </w:pPr>
+      <w:r>
+        <w:rPr>
+          <w:rFonts w:ascii="Courier New" w:cs="Courier New" w:eastAsia="Courier New" w:hAnsi="Courier New"/>
+          <w:sz w:val="17"/>
+          <w:szCs w:val="17"/>
+        </w:rPr>
+        <w:t xml:space="preserve">    return (x &gt; y) - (x &lt; y);</w:t>
+      </w:r>
+    </w:p>
+    <w:p>
+      <w:pPr>
+        <w:shd w:fill="F2F2F2" w:val="clear"/>
+        <w:spacing w:after="0" w:line="220"/>
+        <w:jc w:val="left"/>
+      </w:pPr>
+      <w:r>
+        <w:rPr>
+          <w:rFonts w:ascii="Courier New" w:cs="Courier New" w:eastAsia="Courier New" w:hAnsi="Courier New"/>
+          <w:sz w:val="17"/>
+          <w:szCs w:val="17"/>
+        </w:rPr>
+        <w:t xml:space="preserve">}</w:t>
       </w:r>
     </w:p>
     <w:p>
@@ -2340,7 +2415,7 @@
           <w:sz w:val="17"/>
           <w:szCs w:val="17"/>
         </w:rPr>
-        <w:t xml:space="preserve">static int compara(const void *a, const void *b)</w:t>
+        <w:t xml:space="preserve">int main(int argc, char *argv[])</w:t>
       </w:r>
     </w:p>
     <w:p>
@@ -2370,52 +2445,52 @@
           <w:sz w:val="17"/>
           <w:szCs w:val="17"/>
         </w:rPr>
-        <w:t xml:space="preserve">    int x = *(const int *) a;</w:t>
-      </w:r>
-    </w:p>
-    <w:p>
-      <w:pPr>
-        <w:shd w:fill="F2F2F2" w:val="clear"/>
-        <w:spacing w:after="0" w:line="220"/>
-        <w:jc w:val="left"/>
-      </w:pPr>
-      <w:r>
-        <w:rPr>
-          <w:rFonts w:ascii="Courier New" w:cs="Courier New" w:eastAsia="Courier New" w:hAnsi="Courier New"/>
-          <w:sz w:val="17"/>
-          <w:szCs w:val="17"/>
-        </w:rPr>
-        <w:t xml:space="preserve">    int y = *(const int *) b;</w:t>
-      </w:r>
-    </w:p>
-    <w:p>
-      <w:pPr>
-        <w:shd w:fill="F2F2F2" w:val="clear"/>
-        <w:spacing w:after="0" w:line="220"/>
-        <w:jc w:val="left"/>
-      </w:pPr>
-      <w:r>
-        <w:rPr>
-          <w:rFonts w:ascii="Courier New" w:cs="Courier New" w:eastAsia="Courier New" w:hAnsi="Courier New"/>
-          <w:sz w:val="17"/>
-          <w:szCs w:val="17"/>
-        </w:rPr>
-        <w:t xml:space="preserve">    return (x &gt; y) - (x &lt; y);</w:t>
-      </w:r>
-    </w:p>
-    <w:p>
-      <w:pPr>
-        <w:shd w:fill="F2F2F2" w:val="clear"/>
-        <w:spacing w:after="0" w:line="220"/>
-        <w:jc w:val="left"/>
-      </w:pPr>
-      <w:r>
-        <w:rPr>
-          <w:rFonts w:ascii="Courier New" w:cs="Courier New" w:eastAsia="Courier New" w:hAnsi="Courier New"/>
-          <w:sz w:val="17"/>
-          <w:szCs w:val="17"/>
-        </w:rPr>
-        <w:t xml:space="preserve">}</w:t>
+        <w:t xml:space="preserve">    const char *caminho = (argc &gt; 1) ? argv[1] : "dados.txt";</w:t>
+      </w:r>
+    </w:p>
+    <w:p>
+      <w:pPr>
+        <w:shd w:fill="F2F2F2" w:val="clear"/>
+        <w:spacing w:after="0" w:line="220"/>
+        <w:jc w:val="left"/>
+      </w:pPr>
+      <w:r>
+        <w:rPr>
+          <w:rFonts w:ascii="Courier New" w:cs="Courier New" w:eastAsia="Courier New" w:hAnsi="Courier New"/>
+          <w:sz w:val="17"/>
+          <w:szCs w:val="17"/>
+        </w:rPr>
+        <w:t xml:space="preserve">    int p1[2], p2[2];</w:t>
+      </w:r>
+    </w:p>
+    <w:p>
+      <w:pPr>
+        <w:shd w:fill="F2F2F2" w:val="clear"/>
+        <w:spacing w:after="0" w:line="220"/>
+        <w:jc w:val="left"/>
+      </w:pPr>
+      <w:r>
+        <w:rPr>
+          <w:rFonts w:ascii="Courier New" w:cs="Courier New" w:eastAsia="Courier New" w:hAnsi="Courier New"/>
+          <w:sz w:val="17"/>
+          <w:szCs w:val="17"/>
+        </w:rPr>
+        <w:t xml:space="preserve">    pid_t pid_filtro, pid_contador;</w:t>
+      </w:r>
+    </w:p>
+    <w:p>
+      <w:pPr>
+        <w:shd w:fill="F2F2F2" w:val="clear"/>
+        <w:spacing w:after="0" w:line="220"/>
+        <w:jc w:val="left"/>
+      </w:pPr>
+      <w:r>
+        <w:rPr>
+          <w:rFonts w:ascii="Courier New" w:cs="Courier New" w:eastAsia="Courier New" w:hAnsi="Courier New"/>
+          <w:sz w:val="17"/>
+          <w:szCs w:val="17"/>
+        </w:rPr>
+        <w:t xml:space="preserve">    int status;</w:t>
       </w:r>
     </w:p>
     <w:p>
@@ -2445,82 +2520,52 @@
           <w:sz w:val="17"/>
           <w:szCs w:val="17"/>
         </w:rPr>
-        <w:t xml:space="preserve">int main(int argc, char *argv[])</w:t>
-      </w:r>
-    </w:p>
-    <w:p>
-      <w:pPr>
-        <w:shd w:fill="F2F2F2" w:val="clear"/>
-        <w:spacing w:after="0" w:line="220"/>
-        <w:jc w:val="left"/>
-      </w:pPr>
-      <w:r>
-        <w:rPr>
-          <w:rFonts w:ascii="Courier New" w:cs="Courier New" w:eastAsia="Courier New" w:hAnsi="Courier New"/>
-          <w:sz w:val="17"/>
-          <w:szCs w:val="17"/>
-        </w:rPr>
-        <w:t xml:space="preserve">{</w:t>
-      </w:r>
-    </w:p>
-    <w:p>
-      <w:pPr>
-        <w:shd w:fill="F2F2F2" w:val="clear"/>
-        <w:spacing w:after="0" w:line="220"/>
-        <w:jc w:val="left"/>
-      </w:pPr>
-      <w:r>
-        <w:rPr>
-          <w:rFonts w:ascii="Courier New" w:cs="Courier New" w:eastAsia="Courier New" w:hAnsi="Courier New"/>
-          <w:sz w:val="17"/>
-          <w:szCs w:val="17"/>
-        </w:rPr>
-        <w:t xml:space="preserve">    const char *caminho = (argc &gt; 1) ? argv[1] : "dados.txt";</w:t>
-      </w:r>
-    </w:p>
-    <w:p>
-      <w:pPr>
-        <w:shd w:fill="F2F2F2" w:val="clear"/>
-        <w:spacing w:after="0" w:line="220"/>
-        <w:jc w:val="left"/>
-      </w:pPr>
-      <w:r>
-        <w:rPr>
-          <w:rFonts w:ascii="Courier New" w:cs="Courier New" w:eastAsia="Courier New" w:hAnsi="Courier New"/>
-          <w:sz w:val="17"/>
-          <w:szCs w:val="17"/>
-        </w:rPr>
-        <w:t xml:space="preserve">    int p1[2], p2[2];</w:t>
-      </w:r>
-    </w:p>
-    <w:p>
-      <w:pPr>
-        <w:shd w:fill="F2F2F2" w:val="clear"/>
-        <w:spacing w:after="0" w:line="220"/>
-        <w:jc w:val="left"/>
-      </w:pPr>
-      <w:r>
-        <w:rPr>
-          <w:rFonts w:ascii="Courier New" w:cs="Courier New" w:eastAsia="Courier New" w:hAnsi="Courier New"/>
-          <w:sz w:val="17"/>
-          <w:szCs w:val="17"/>
-        </w:rPr>
-        <w:t xml:space="preserve">    pid_t pid_filtro, pid_contador;</w:t>
-      </w:r>
-    </w:p>
-    <w:p>
-      <w:pPr>
-        <w:shd w:fill="F2F2F2" w:val="clear"/>
-        <w:spacing w:after="0" w:line="220"/>
-        <w:jc w:val="left"/>
-      </w:pPr>
-      <w:r>
-        <w:rPr>
-          <w:rFonts w:ascii="Courier New" w:cs="Courier New" w:eastAsia="Courier New" w:hAnsi="Courier New"/>
-          <w:sz w:val="17"/>
-          <w:szCs w:val="17"/>
-        </w:rPr>
-        <w:t xml:space="preserve">    int status;</w:t>
+        <w:t xml:space="preserve">    if (pipe(p1) == -1 || pipe(p2) == -1) {</w:t>
+      </w:r>
+    </w:p>
+    <w:p>
+      <w:pPr>
+        <w:shd w:fill="F2F2F2" w:val="clear"/>
+        <w:spacing w:after="0" w:line="220"/>
+        <w:jc w:val="left"/>
+      </w:pPr>
+      <w:r>
+        <w:rPr>
+          <w:rFonts w:ascii="Courier New" w:cs="Courier New" w:eastAsia="Courier New" w:hAnsi="Courier New"/>
+          <w:sz w:val="17"/>
+          <w:szCs w:val="17"/>
+        </w:rPr>
+        <w:t xml:space="preserve">        perror("pipe");</w:t>
+      </w:r>
+    </w:p>
+    <w:p>
+      <w:pPr>
+        <w:shd w:fill="F2F2F2" w:val="clear"/>
+        <w:spacing w:after="0" w:line="220"/>
+        <w:jc w:val="left"/>
+      </w:pPr>
+      <w:r>
+        <w:rPr>
+          <w:rFonts w:ascii="Courier New" w:cs="Courier New" w:eastAsia="Courier New" w:hAnsi="Courier New"/>
+          <w:sz w:val="17"/>
+          <w:szCs w:val="17"/>
+        </w:rPr>
+        <w:t xml:space="preserve">        return 1;</w:t>
+      </w:r>
+    </w:p>
+    <w:p>
+      <w:pPr>
+        <w:shd w:fill="F2F2F2" w:val="clear"/>
+        <w:spacing w:after="0" w:line="220"/>
+        <w:jc w:val="left"/>
+      </w:pPr>
+      <w:r>
+        <w:rPr>
+          <w:rFonts w:ascii="Courier New" w:cs="Courier New" w:eastAsia="Courier New" w:hAnsi="Courier New"/>
+          <w:sz w:val="17"/>
+          <w:szCs w:val="17"/>
+        </w:rPr>
+        <w:t xml:space="preserve">    }</w:t>
       </w:r>
     </w:p>
     <w:p>
@@ -2550,22 +2595,52 @@
           <w:sz w:val="17"/>
           <w:szCs w:val="17"/>
         </w:rPr>
-        <w:t xml:space="preserve">    if (pipe(p1) == -1 || pipe(p2) == -1) {</w:t>
-      </w:r>
-    </w:p>
-    <w:p>
-      <w:pPr>
-        <w:shd w:fill="F2F2F2" w:val="clear"/>
-        <w:spacing w:after="0" w:line="220"/>
-        <w:jc w:val="left"/>
-      </w:pPr>
-      <w:r>
-        <w:rPr>
-          <w:rFonts w:ascii="Courier New" w:cs="Courier New" w:eastAsia="Courier New" w:hAnsi="Courier New"/>
-          <w:sz w:val="17"/>
-          <w:szCs w:val="17"/>
-        </w:rPr>
-        <w:t xml:space="preserve">        perror("pipe");</w:t>
+        <w:t xml:space="preserve">    fflush(stdout);</w:t>
+      </w:r>
+    </w:p>
+    <w:p>
+      <w:pPr>
+        <w:shd w:fill="F2F2F2" w:val="clear"/>
+        <w:spacing w:after="0" w:line="220"/>
+        <w:jc w:val="left"/>
+      </w:pPr>
+      <w:r>
+        <w:rPr>
+          <w:rFonts w:ascii="Courier New" w:cs="Courier New" w:eastAsia="Courier New" w:hAnsi="Courier New"/>
+          <w:sz w:val="17"/>
+          <w:szCs w:val="17"/>
+        </w:rPr>
+        <w:t xml:space="preserve">    pid_filtro = fork();</w:t>
+      </w:r>
+    </w:p>
+    <w:p>
+      <w:pPr>
+        <w:shd w:fill="F2F2F2" w:val="clear"/>
+        <w:spacing w:after="0" w:line="220"/>
+        <w:jc w:val="left"/>
+      </w:pPr>
+      <w:r>
+        <w:rPr>
+          <w:rFonts w:ascii="Courier New" w:cs="Courier New" w:eastAsia="Courier New" w:hAnsi="Courier New"/>
+          <w:sz w:val="17"/>
+          <w:szCs w:val="17"/>
+        </w:rPr>
+        <w:t xml:space="preserve">    if (pid_filtro == -1) {</w:t>
+      </w:r>
+    </w:p>
+    <w:p>
+      <w:pPr>
+        <w:shd w:fill="F2F2F2" w:val="clear"/>
+        <w:spacing w:after="0" w:line="220"/>
+        <w:jc w:val="left"/>
+      </w:pPr>
+      <w:r>
+        <w:rPr>
+          <w:rFonts w:ascii="Courier New" w:cs="Courier New" w:eastAsia="Courier New" w:hAnsi="Courier New"/>
+          <w:sz w:val="17"/>
+          <w:szCs w:val="17"/>
+        </w:rPr>
+        <w:t xml:space="preserve">        perror("fork");</w:t>
       </w:r>
     </w:p>
     <w:p>
@@ -2625,82 +2700,37 @@
           <w:sz w:val="17"/>
           <w:szCs w:val="17"/>
         </w:rPr>
-        <w:t xml:space="preserve">    fflush(stdout);</w:t>
-      </w:r>
-    </w:p>
-    <w:p>
-      <w:pPr>
-        <w:shd w:fill="F2F2F2" w:val="clear"/>
-        <w:spacing w:after="0" w:line="220"/>
-        <w:jc w:val="left"/>
-      </w:pPr>
-      <w:r>
-        <w:rPr>
-          <w:rFonts w:ascii="Courier New" w:cs="Courier New" w:eastAsia="Courier New" w:hAnsi="Courier New"/>
-          <w:sz w:val="17"/>
-          <w:szCs w:val="17"/>
-        </w:rPr>
-        <w:t xml:space="preserve">    pid_filtro = fork();</w:t>
-      </w:r>
-    </w:p>
-    <w:p>
-      <w:pPr>
-        <w:shd w:fill="F2F2F2" w:val="clear"/>
-        <w:spacing w:after="0" w:line="220"/>
-        <w:jc w:val="left"/>
-      </w:pPr>
-      <w:r>
-        <w:rPr>
-          <w:rFonts w:ascii="Courier New" w:cs="Courier New" w:eastAsia="Courier New" w:hAnsi="Courier New"/>
-          <w:sz w:val="17"/>
-          <w:szCs w:val="17"/>
-        </w:rPr>
-        <w:t xml:space="preserve">    if (pid_filtro == -1) {</w:t>
-      </w:r>
-    </w:p>
-    <w:p>
-      <w:pPr>
-        <w:shd w:fill="F2F2F2" w:val="clear"/>
-        <w:spacing w:after="0" w:line="220"/>
-        <w:jc w:val="left"/>
-      </w:pPr>
-      <w:r>
-        <w:rPr>
-          <w:rFonts w:ascii="Courier New" w:cs="Courier New" w:eastAsia="Courier New" w:hAnsi="Courier New"/>
-          <w:sz w:val="17"/>
-          <w:szCs w:val="17"/>
-        </w:rPr>
-        <w:t xml:space="preserve">        perror("fork");</w:t>
-      </w:r>
-    </w:p>
-    <w:p>
-      <w:pPr>
-        <w:shd w:fill="F2F2F2" w:val="clear"/>
-        <w:spacing w:after="0" w:line="220"/>
-        <w:jc w:val="left"/>
-      </w:pPr>
-      <w:r>
-        <w:rPr>
-          <w:rFonts w:ascii="Courier New" w:cs="Courier New" w:eastAsia="Courier New" w:hAnsi="Courier New"/>
-          <w:sz w:val="17"/>
-          <w:szCs w:val="17"/>
-        </w:rPr>
-        <w:t xml:space="preserve">        return 1;</w:t>
-      </w:r>
-    </w:p>
-    <w:p>
-      <w:pPr>
-        <w:shd w:fill="F2F2F2" w:val="clear"/>
-        <w:spacing w:after="0" w:line="220"/>
-        <w:jc w:val="left"/>
-      </w:pPr>
-      <w:r>
-        <w:rPr>
-          <w:rFonts w:ascii="Courier New" w:cs="Courier New" w:eastAsia="Courier New" w:hAnsi="Courier New"/>
-          <w:sz w:val="17"/>
-          <w:szCs w:val="17"/>
-        </w:rPr>
-        <w:t xml:space="preserve">    }</w:t>
+        <w:t xml:space="preserve">    if (pid_filtro == 0) {</w:t>
+      </w:r>
+    </w:p>
+    <w:p>
+      <w:pPr>
+        <w:shd w:fill="F2F2F2" w:val="clear"/>
+        <w:spacing w:after="0" w:line="220"/>
+        <w:jc w:val="left"/>
+      </w:pPr>
+      <w:r>
+        <w:rPr>
+          <w:rFonts w:ascii="Courier New" w:cs="Courier New" w:eastAsia="Courier New" w:hAnsi="Courier New"/>
+          <w:sz w:val="17"/>
+          <w:szCs w:val="17"/>
+        </w:rPr>
+        <w:t xml:space="preserve">        int *v = NULL;</w:t>
+      </w:r>
+    </w:p>
+    <w:p>
+      <w:pPr>
+        <w:shd w:fill="F2F2F2" w:val="clear"/>
+        <w:spacing w:after="0" w:line="220"/>
+        <w:jc w:val="left"/>
+      </w:pPr>
+      <w:r>
+        <w:rPr>
+          <w:rFonts w:ascii="Courier New" w:cs="Courier New" w:eastAsia="Courier New" w:hAnsi="Courier New"/>
+          <w:sz w:val="17"/>
+          <w:szCs w:val="17"/>
+        </w:rPr>
+        <w:t xml:space="preserve">        int cap = 0, qtd = 0, valor, i;</w:t>
       </w:r>
     </w:p>
     <w:p>
@@ -2730,37 +2760,52 @@
           <w:sz w:val="17"/>
           <w:szCs w:val="17"/>
         </w:rPr>
-        <w:t xml:space="preserve">    if (pid_filtro == 0) {</w:t>
-      </w:r>
-    </w:p>
-    <w:p>
-      <w:pPr>
-        <w:shd w:fill="F2F2F2" w:val="clear"/>
-        <w:spacing w:after="0" w:line="220"/>
-        <w:jc w:val="left"/>
-      </w:pPr>
-      <w:r>
-        <w:rPr>
-          <w:rFonts w:ascii="Courier New" w:cs="Courier New" w:eastAsia="Courier New" w:hAnsi="Courier New"/>
-          <w:sz w:val="17"/>
-          <w:szCs w:val="17"/>
-        </w:rPr>
-        <w:t xml:space="preserve">        static int v[MAX];</w:t>
-      </w:r>
-    </w:p>
-    <w:p>
-      <w:pPr>
-        <w:shd w:fill="F2F2F2" w:val="clear"/>
-        <w:spacing w:after="0" w:line="220"/>
-        <w:jc w:val="left"/>
-      </w:pPr>
-      <w:r>
-        <w:rPr>
-          <w:rFonts w:ascii="Courier New" w:cs="Courier New" w:eastAsia="Courier New" w:hAnsi="Courier New"/>
-          <w:sz w:val="17"/>
-          <w:szCs w:val="17"/>
-        </w:rPr>
-        <w:t xml:space="preserve">        int qtd = 0, valor, i;</w:t>
+        <w:t xml:space="preserve">        close(p1[1]);</w:t>
+      </w:r>
+    </w:p>
+    <w:p>
+      <w:pPr>
+        <w:shd w:fill="F2F2F2" w:val="clear"/>
+        <w:spacing w:after="0" w:line="220"/>
+        <w:jc w:val="left"/>
+      </w:pPr>
+      <w:r>
+        <w:rPr>
+          <w:rFonts w:ascii="Courier New" w:cs="Courier New" w:eastAsia="Courier New" w:hAnsi="Courier New"/>
+          <w:sz w:val="17"/>
+          <w:szCs w:val="17"/>
+        </w:rPr>
+        <w:t xml:space="preserve">        close(p2[0]);</w:t>
+      </w:r>
+    </w:p>
+    <w:p>
+      <w:pPr>
+        <w:shd w:fill="F2F2F2" w:val="clear"/>
+        <w:spacing w:after="0" w:line="220"/>
+        <w:jc w:val="left"/>
+      </w:pPr>
+      <w:r>
+        <w:rPr>
+          <w:rFonts w:ascii="Courier New" w:cs="Courier New" w:eastAsia="Courier New" w:hAnsi="Courier New"/>
+          <w:sz w:val="17"/>
+          <w:szCs w:val="17"/>
+        </w:rPr>
+        <w:t xml:space="preserve">        printf("[P2 filtro   pid=%d] ordena e remove duplicados\n", getpid());</w:t>
+      </w:r>
+    </w:p>
+    <w:p>
+      <w:pPr>
+        <w:shd w:fill="F2F2F2" w:val="clear"/>
+        <w:spacing w:after="0" w:line="220"/>
+        <w:jc w:val="left"/>
+      </w:pPr>
+      <w:r>
+        <w:rPr>
+          <w:rFonts w:ascii="Courier New" w:cs="Courier New" w:eastAsia="Courier New" w:hAnsi="Courier New"/>
+          <w:sz w:val="17"/>
+          <w:szCs w:val="17"/>
+        </w:rPr>
+        <w:t xml:space="preserve">        fflush(stdout);</w:t>
       </w:r>
     </w:p>
     <w:p>
@@ -2790,52 +2835,247 @@
           <w:sz w:val="17"/>
           <w:szCs w:val="17"/>
         </w:rPr>
-        <w:t xml:space="preserve">        close(p1[1]);</w:t>
-      </w:r>
-    </w:p>
-    <w:p>
-      <w:pPr>
-        <w:shd w:fill="F2F2F2" w:val="clear"/>
-        <w:spacing w:after="0" w:line="220"/>
-        <w:jc w:val="left"/>
-      </w:pPr>
-      <w:r>
-        <w:rPr>
-          <w:rFonts w:ascii="Courier New" w:cs="Courier New" w:eastAsia="Courier New" w:hAnsi="Courier New"/>
-          <w:sz w:val="17"/>
-          <w:szCs w:val="17"/>
-        </w:rPr>
-        <w:t xml:space="preserve">        close(p2[0]);</w:t>
-      </w:r>
-    </w:p>
-    <w:p>
-      <w:pPr>
-        <w:shd w:fill="F2F2F2" w:val="clear"/>
-        <w:spacing w:after="0" w:line="220"/>
-        <w:jc w:val="left"/>
-      </w:pPr>
-      <w:r>
-        <w:rPr>
-          <w:rFonts w:ascii="Courier New" w:cs="Courier New" w:eastAsia="Courier New" w:hAnsi="Courier New"/>
-          <w:sz w:val="17"/>
-          <w:szCs w:val="17"/>
-        </w:rPr>
-        <w:t xml:space="preserve">        printf("[P2 filtro   pid=%d] ordena e remove duplicados\n", getpid());</w:t>
-      </w:r>
-    </w:p>
-    <w:p>
-      <w:pPr>
-        <w:shd w:fill="F2F2F2" w:val="clear"/>
-        <w:spacing w:after="0" w:line="220"/>
-        <w:jc w:val="left"/>
-      </w:pPr>
-      <w:r>
-        <w:rPr>
-          <w:rFonts w:ascii="Courier New" w:cs="Courier New" w:eastAsia="Courier New" w:hAnsi="Courier New"/>
-          <w:sz w:val="17"/>
-          <w:szCs w:val="17"/>
-        </w:rPr>
-        <w:t xml:space="preserve">        fflush(stdout);</w:t>
+        <w:t xml:space="preserve">        while (read(p1[0], &amp;valor, sizeof(int)) == sizeof(int)) {</w:t>
+      </w:r>
+    </w:p>
+    <w:p>
+      <w:pPr>
+        <w:shd w:fill="F2F2F2" w:val="clear"/>
+        <w:spacing w:after="0" w:line="220"/>
+        <w:jc w:val="left"/>
+      </w:pPr>
+      <w:r>
+        <w:rPr>
+          <w:rFonts w:ascii="Courier New" w:cs="Courier New" w:eastAsia="Courier New" w:hAnsi="Courier New"/>
+          <w:sz w:val="17"/>
+          <w:szCs w:val="17"/>
+        </w:rPr>
+        <w:t xml:space="preserve">            if (qtd == cap) {</w:t>
+      </w:r>
+    </w:p>
+    <w:p>
+      <w:pPr>
+        <w:shd w:fill="F2F2F2" w:val="clear"/>
+        <w:spacing w:after="0" w:line="220"/>
+        <w:jc w:val="left"/>
+      </w:pPr>
+      <w:r>
+        <w:rPr>
+          <w:rFonts w:ascii="Courier New" w:cs="Courier New" w:eastAsia="Courier New" w:hAnsi="Courier New"/>
+          <w:sz w:val="17"/>
+          <w:szCs w:val="17"/>
+        </w:rPr>
+        <w:t xml:space="preserve">                int novo = (cap == 0) ? 1024 : cap * 2;</w:t>
+      </w:r>
+    </w:p>
+    <w:p>
+      <w:pPr>
+        <w:shd w:fill="F2F2F2" w:val="clear"/>
+        <w:spacing w:after="0" w:line="220"/>
+        <w:jc w:val="left"/>
+      </w:pPr>
+      <w:r>
+        <w:rPr>
+          <w:rFonts w:ascii="Courier New" w:cs="Courier New" w:eastAsia="Courier New" w:hAnsi="Courier New"/>
+          <w:sz w:val="17"/>
+          <w:szCs w:val="17"/>
+        </w:rPr>
+        <w:t xml:space="preserve">                int *aux = realloc(v, (size_t) novo * sizeof(int));</w:t>
+      </w:r>
+    </w:p>
+    <w:p>
+      <w:pPr>
+        <w:shd w:fill="F2F2F2" w:val="clear"/>
+        <w:spacing w:after="0" w:line="220"/>
+        <w:jc w:val="left"/>
+      </w:pPr>
+      <w:r>
+        <w:rPr>
+          <w:rFonts w:ascii="Courier New" w:cs="Courier New" w:eastAsia="Courier New" w:hAnsi="Courier New"/>
+          <w:sz w:val="17"/>
+          <w:szCs w:val="17"/>
+        </w:rPr>
+        <w:t xml:space="preserve">                if (aux == NULL) {</w:t>
+      </w:r>
+    </w:p>
+    <w:p>
+      <w:pPr>
+        <w:shd w:fill="F2F2F2" w:val="clear"/>
+        <w:spacing w:after="0" w:line="220"/>
+        <w:jc w:val="left"/>
+      </w:pPr>
+      <w:r>
+        <w:rPr>
+          <w:rFonts w:ascii="Courier New" w:cs="Courier New" w:eastAsia="Courier New" w:hAnsi="Courier New"/>
+          <w:sz w:val="17"/>
+          <w:szCs w:val="17"/>
+        </w:rPr>
+        <w:t xml:space="preserve">                    perror("realloc");</w:t>
+      </w:r>
+    </w:p>
+    <w:p>
+      <w:pPr>
+        <w:shd w:fill="F2F2F2" w:val="clear"/>
+        <w:spacing w:after="0" w:line="220"/>
+        <w:jc w:val="left"/>
+      </w:pPr>
+      <w:r>
+        <w:rPr>
+          <w:rFonts w:ascii="Courier New" w:cs="Courier New" w:eastAsia="Courier New" w:hAnsi="Courier New"/>
+          <w:sz w:val="17"/>
+          <w:szCs w:val="17"/>
+        </w:rPr>
+        <w:t xml:space="preserve">                    free(v);</w:t>
+      </w:r>
+    </w:p>
+    <w:p>
+      <w:pPr>
+        <w:shd w:fill="F2F2F2" w:val="clear"/>
+        <w:spacing w:after="0" w:line="220"/>
+        <w:jc w:val="left"/>
+      </w:pPr>
+      <w:r>
+        <w:rPr>
+          <w:rFonts w:ascii="Courier New" w:cs="Courier New" w:eastAsia="Courier New" w:hAnsi="Courier New"/>
+          <w:sz w:val="17"/>
+          <w:szCs w:val="17"/>
+        </w:rPr>
+        <w:t xml:space="preserve">                    close(p1[0]);</w:t>
+      </w:r>
+    </w:p>
+    <w:p>
+      <w:pPr>
+        <w:shd w:fill="F2F2F2" w:val="clear"/>
+        <w:spacing w:after="0" w:line="220"/>
+        <w:jc w:val="left"/>
+      </w:pPr>
+      <w:r>
+        <w:rPr>
+          <w:rFonts w:ascii="Courier New" w:cs="Courier New" w:eastAsia="Courier New" w:hAnsi="Courier New"/>
+          <w:sz w:val="17"/>
+          <w:szCs w:val="17"/>
+        </w:rPr>
+        <w:t xml:space="preserve">                    close(p2[1]);</w:t>
+      </w:r>
+    </w:p>
+    <w:p>
+      <w:pPr>
+        <w:shd w:fill="F2F2F2" w:val="clear"/>
+        <w:spacing w:after="0" w:line="220"/>
+        <w:jc w:val="left"/>
+      </w:pPr>
+      <w:r>
+        <w:rPr>
+          <w:rFonts w:ascii="Courier New" w:cs="Courier New" w:eastAsia="Courier New" w:hAnsi="Courier New"/>
+          <w:sz w:val="17"/>
+          <w:szCs w:val="17"/>
+        </w:rPr>
+        <w:t xml:space="preserve">                    exit(1);</w:t>
+      </w:r>
+    </w:p>
+    <w:p>
+      <w:pPr>
+        <w:shd w:fill="F2F2F2" w:val="clear"/>
+        <w:spacing w:after="0" w:line="220"/>
+        <w:jc w:val="left"/>
+      </w:pPr>
+      <w:r>
+        <w:rPr>
+          <w:rFonts w:ascii="Courier New" w:cs="Courier New" w:eastAsia="Courier New" w:hAnsi="Courier New"/>
+          <w:sz w:val="17"/>
+          <w:szCs w:val="17"/>
+        </w:rPr>
+        <w:t xml:space="preserve">                }</w:t>
+      </w:r>
+    </w:p>
+    <w:p>
+      <w:pPr>
+        <w:shd w:fill="F2F2F2" w:val="clear"/>
+        <w:spacing w:after="0" w:line="220"/>
+        <w:jc w:val="left"/>
+      </w:pPr>
+      <w:r>
+        <w:rPr>
+          <w:rFonts w:ascii="Courier New" w:cs="Courier New" w:eastAsia="Courier New" w:hAnsi="Courier New"/>
+          <w:sz w:val="17"/>
+          <w:szCs w:val="17"/>
+        </w:rPr>
+        <w:t xml:space="preserve">                v = aux;</w:t>
+      </w:r>
+    </w:p>
+    <w:p>
+      <w:pPr>
+        <w:shd w:fill="F2F2F2" w:val="clear"/>
+        <w:spacing w:after="0" w:line="220"/>
+        <w:jc w:val="left"/>
+      </w:pPr>
+      <w:r>
+        <w:rPr>
+          <w:rFonts w:ascii="Courier New" w:cs="Courier New" w:eastAsia="Courier New" w:hAnsi="Courier New"/>
+          <w:sz w:val="17"/>
+          <w:szCs w:val="17"/>
+        </w:rPr>
+        <w:t xml:space="preserve">                cap = novo;</w:t>
+      </w:r>
+    </w:p>
+    <w:p>
+      <w:pPr>
+        <w:shd w:fill="F2F2F2" w:val="clear"/>
+        <w:spacing w:after="0" w:line="220"/>
+        <w:jc w:val="left"/>
+      </w:pPr>
+      <w:r>
+        <w:rPr>
+          <w:rFonts w:ascii="Courier New" w:cs="Courier New" w:eastAsia="Courier New" w:hAnsi="Courier New"/>
+          <w:sz w:val="17"/>
+          <w:szCs w:val="17"/>
+        </w:rPr>
+        <w:t xml:space="preserve">            }</w:t>
+      </w:r>
+    </w:p>
+    <w:p>
+      <w:pPr>
+        <w:shd w:fill="F2F2F2" w:val="clear"/>
+        <w:spacing w:after="0" w:line="220"/>
+        <w:jc w:val="left"/>
+      </w:pPr>
+      <w:r>
+        <w:rPr>
+          <w:rFonts w:ascii="Courier New" w:cs="Courier New" w:eastAsia="Courier New" w:hAnsi="Courier New"/>
+          <w:sz w:val="17"/>
+          <w:szCs w:val="17"/>
+        </w:rPr>
+        <w:t xml:space="preserve">            v[qtd++] = valor;</w:t>
+      </w:r>
+    </w:p>
+    <w:p>
+      <w:pPr>
+        <w:shd w:fill="F2F2F2" w:val="clear"/>
+        <w:spacing w:after="0" w:line="220"/>
+        <w:jc w:val="left"/>
+      </w:pPr>
+      <w:r>
+        <w:rPr>
+          <w:rFonts w:ascii="Courier New" w:cs="Courier New" w:eastAsia="Courier New" w:hAnsi="Courier New"/>
+          <w:sz w:val="17"/>
+          <w:szCs w:val="17"/>
+        </w:rPr>
+        <w:t xml:space="preserve">        }</w:t>
+      </w:r>
+    </w:p>
+    <w:p>
+      <w:pPr>
+        <w:shd w:fill="F2F2F2" w:val="clear"/>
+        <w:spacing w:after="0" w:line="220"/>
+        <w:jc w:val="left"/>
+      </w:pPr>
+      <w:r>
+        <w:rPr>
+          <w:rFonts w:ascii="Courier New" w:cs="Courier New" w:eastAsia="Courier New" w:hAnsi="Courier New"/>
+          <w:sz w:val="17"/>
+          <w:szCs w:val="17"/>
+        </w:rPr>
+        <w:t xml:space="preserve">        close(p1[0]);</w:t>
       </w:r>
     </w:p>
     <w:p>
@@ -2865,37 +3105,22 @@
           <w:sz w:val="17"/>
           <w:szCs w:val="17"/>
         </w:rPr>
-        <w:t xml:space="preserve">        while (qtd &lt; MAX &amp;&amp; read(p1[0], &amp;valor, sizeof(int)) == sizeof(int))</w:t>
-      </w:r>
-    </w:p>
-    <w:p>
-      <w:pPr>
-        <w:shd w:fill="F2F2F2" w:val="clear"/>
-        <w:spacing w:after="0" w:line="220"/>
-        <w:jc w:val="left"/>
-      </w:pPr>
-      <w:r>
-        <w:rPr>
-          <w:rFonts w:ascii="Courier New" w:cs="Courier New" w:eastAsia="Courier New" w:hAnsi="Courier New"/>
-          <w:sz w:val="17"/>
-          <w:szCs w:val="17"/>
-        </w:rPr>
-        <w:t xml:space="preserve">            v[qtd++] = valor;</w:t>
-      </w:r>
-    </w:p>
-    <w:p>
-      <w:pPr>
-        <w:shd w:fill="F2F2F2" w:val="clear"/>
-        <w:spacing w:after="0" w:line="220"/>
-        <w:jc w:val="left"/>
-      </w:pPr>
-      <w:r>
-        <w:rPr>
-          <w:rFonts w:ascii="Courier New" w:cs="Courier New" w:eastAsia="Courier New" w:hAnsi="Courier New"/>
-          <w:sz w:val="17"/>
-          <w:szCs w:val="17"/>
-        </w:rPr>
-        <w:t xml:space="preserve">        close(p1[0]);</w:t>
+        <w:t xml:space="preserve">        if (qtd &gt; 0)</w:t>
+      </w:r>
+    </w:p>
+    <w:p>
+      <w:pPr>
+        <w:shd w:fill="F2F2F2" w:val="clear"/>
+        <w:spacing w:after="0" w:line="220"/>
+        <w:jc w:val="left"/>
+      </w:pPr>
+      <w:r>
+        <w:rPr>
+          <w:rFonts w:ascii="Courier New" w:cs="Courier New" w:eastAsia="Courier New" w:hAnsi="Courier New"/>
+          <w:sz w:val="17"/>
+          <w:szCs w:val="17"/>
+        </w:rPr>
+        <w:t xml:space="preserve">            qsort(v, qtd, sizeof(int), compara);</w:t>
       </w:r>
     </w:p>
     <w:p>
@@ -2925,7 +3150,112 @@
           <w:sz w:val="17"/>
           <w:szCs w:val="17"/>
         </w:rPr>
-        <w:t xml:space="preserve">        qsort(v, qtd, sizeof(int), compara);</w:t>
+        <w:t xml:space="preserve">        for (i = 0; i &lt; qtd; i++) {</w:t>
+      </w:r>
+    </w:p>
+    <w:p>
+      <w:pPr>
+        <w:shd w:fill="F2F2F2" w:val="clear"/>
+        <w:spacing w:after="0" w:line="220"/>
+        <w:jc w:val="left"/>
+      </w:pPr>
+      <w:r>
+        <w:rPr>
+          <w:rFonts w:ascii="Courier New" w:cs="Courier New" w:eastAsia="Courier New" w:hAnsi="Courier New"/>
+          <w:sz w:val="17"/>
+          <w:szCs w:val="17"/>
+        </w:rPr>
+        <w:t xml:space="preserve">            if (i &gt; 0 &amp;&amp; v[i] == v[i - 1])</w:t>
+      </w:r>
+    </w:p>
+    <w:p>
+      <w:pPr>
+        <w:shd w:fill="F2F2F2" w:val="clear"/>
+        <w:spacing w:after="0" w:line="220"/>
+        <w:jc w:val="left"/>
+      </w:pPr>
+      <w:r>
+        <w:rPr>
+          <w:rFonts w:ascii="Courier New" w:cs="Courier New" w:eastAsia="Courier New" w:hAnsi="Courier New"/>
+          <w:sz w:val="17"/>
+          <w:szCs w:val="17"/>
+        </w:rPr>
+        <w:t xml:space="preserve">                continue;</w:t>
+      </w:r>
+    </w:p>
+    <w:p>
+      <w:pPr>
+        <w:shd w:fill="F2F2F2" w:val="clear"/>
+        <w:spacing w:after="0" w:line="220"/>
+        <w:jc w:val="left"/>
+      </w:pPr>
+      <w:r>
+        <w:rPr>
+          <w:rFonts w:ascii="Courier New" w:cs="Courier New" w:eastAsia="Courier New" w:hAnsi="Courier New"/>
+          <w:sz w:val="17"/>
+          <w:szCs w:val="17"/>
+        </w:rPr>
+        <w:t xml:space="preserve">            if (write(p2[1], &amp;v[i], sizeof(int)) != sizeof(int)) {</w:t>
+      </w:r>
+    </w:p>
+    <w:p>
+      <w:pPr>
+        <w:shd w:fill="F2F2F2" w:val="clear"/>
+        <w:spacing w:after="0" w:line="220"/>
+        <w:jc w:val="left"/>
+      </w:pPr>
+      <w:r>
+        <w:rPr>
+          <w:rFonts w:ascii="Courier New" w:cs="Courier New" w:eastAsia="Courier New" w:hAnsi="Courier New"/>
+          <w:sz w:val="17"/>
+          <w:szCs w:val="17"/>
+        </w:rPr>
+        <w:t xml:space="preserve">                perror("write p2");</w:t>
+      </w:r>
+    </w:p>
+    <w:p>
+      <w:pPr>
+        <w:shd w:fill="F2F2F2" w:val="clear"/>
+        <w:spacing w:after="0" w:line="220"/>
+        <w:jc w:val="left"/>
+      </w:pPr>
+      <w:r>
+        <w:rPr>
+          <w:rFonts w:ascii="Courier New" w:cs="Courier New" w:eastAsia="Courier New" w:hAnsi="Courier New"/>
+          <w:sz w:val="17"/>
+          <w:szCs w:val="17"/>
+        </w:rPr>
+        <w:t xml:space="preserve">                break;</w:t>
+      </w:r>
+    </w:p>
+    <w:p>
+      <w:pPr>
+        <w:shd w:fill="F2F2F2" w:val="clear"/>
+        <w:spacing w:after="0" w:line="220"/>
+        <w:jc w:val="left"/>
+      </w:pPr>
+      <w:r>
+        <w:rPr>
+          <w:rFonts w:ascii="Courier New" w:cs="Courier New" w:eastAsia="Courier New" w:hAnsi="Courier New"/>
+          <w:sz w:val="17"/>
+          <w:szCs w:val="17"/>
+        </w:rPr>
+        <w:t xml:space="preserve">            }</w:t>
+      </w:r>
+    </w:p>
+    <w:p>
+      <w:pPr>
+        <w:shd w:fill="F2F2F2" w:val="clear"/>
+        <w:spacing w:after="0" w:line="220"/>
+        <w:jc w:val="left"/>
+      </w:pPr>
+      <w:r>
+        <w:rPr>
+          <w:rFonts w:ascii="Courier New" w:cs="Courier New" w:eastAsia="Courier New" w:hAnsi="Courier New"/>
+          <w:sz w:val="17"/>
+          <w:szCs w:val="17"/>
+        </w:rPr>
+        <w:t xml:space="preserve">        }</w:t>
       </w:r>
     </w:p>
     <w:p>
@@ -2955,127 +3285,7 @@
           <w:sz w:val="17"/>
           <w:szCs w:val="17"/>
         </w:rPr>
-        <w:t xml:space="preserve">        for (i = 0; i &lt; qtd; i++) {</w:t>
-      </w:r>
-    </w:p>
-    <w:p>
-      <w:pPr>
-        <w:shd w:fill="F2F2F2" w:val="clear"/>
-        <w:spacing w:after="0" w:line="220"/>
-        <w:jc w:val="left"/>
-      </w:pPr>
-      <w:r>
-        <w:rPr>
-          <w:rFonts w:ascii="Courier New" w:cs="Courier New" w:eastAsia="Courier New" w:hAnsi="Courier New"/>
-          <w:sz w:val="17"/>
-          <w:szCs w:val="17"/>
-        </w:rPr>
-        <w:t xml:space="preserve">            if (i &gt; 0 &amp;&amp; v[i] == v[i - 1])</w:t>
-      </w:r>
-    </w:p>
-    <w:p>
-      <w:pPr>
-        <w:shd w:fill="F2F2F2" w:val="clear"/>
-        <w:spacing w:after="0" w:line="220"/>
-        <w:jc w:val="left"/>
-      </w:pPr>
-      <w:r>
-        <w:rPr>
-          <w:rFonts w:ascii="Courier New" w:cs="Courier New" w:eastAsia="Courier New" w:hAnsi="Courier New"/>
-          <w:sz w:val="17"/>
-          <w:szCs w:val="17"/>
-        </w:rPr>
-        <w:t xml:space="preserve">                continue;</w:t>
-      </w:r>
-    </w:p>
-    <w:p>
-      <w:pPr>
-        <w:shd w:fill="F2F2F2" w:val="clear"/>
-        <w:spacing w:after="0" w:line="220"/>
-        <w:jc w:val="left"/>
-      </w:pPr>
-      <w:r>
-        <w:rPr>
-          <w:rFonts w:ascii="Courier New" w:cs="Courier New" w:eastAsia="Courier New" w:hAnsi="Courier New"/>
-          <w:sz w:val="17"/>
-          <w:szCs w:val="17"/>
-        </w:rPr>
-        <w:t xml:space="preserve">            if (write(p2[1], &amp;v[i], sizeof(int)) != sizeof(int)) {</w:t>
-      </w:r>
-    </w:p>
-    <w:p>
-      <w:pPr>
-        <w:shd w:fill="F2F2F2" w:val="clear"/>
-        <w:spacing w:after="0" w:line="220"/>
-        <w:jc w:val="left"/>
-      </w:pPr>
-      <w:r>
-        <w:rPr>
-          <w:rFonts w:ascii="Courier New" w:cs="Courier New" w:eastAsia="Courier New" w:hAnsi="Courier New"/>
-          <w:sz w:val="17"/>
-          <w:szCs w:val="17"/>
-        </w:rPr>
-        <w:t xml:space="preserve">                perror("write p2");</w:t>
-      </w:r>
-    </w:p>
-    <w:p>
-      <w:pPr>
-        <w:shd w:fill="F2F2F2" w:val="clear"/>
-        <w:spacing w:after="0" w:line="220"/>
-        <w:jc w:val="left"/>
-      </w:pPr>
-      <w:r>
-        <w:rPr>
-          <w:rFonts w:ascii="Courier New" w:cs="Courier New" w:eastAsia="Courier New" w:hAnsi="Courier New"/>
-          <w:sz w:val="17"/>
-          <w:szCs w:val="17"/>
-        </w:rPr>
-        <w:t xml:space="preserve">                break;</w:t>
-      </w:r>
-    </w:p>
-    <w:p>
-      <w:pPr>
-        <w:shd w:fill="F2F2F2" w:val="clear"/>
-        <w:spacing w:after="0" w:line="220"/>
-        <w:jc w:val="left"/>
-      </w:pPr>
-      <w:r>
-        <w:rPr>
-          <w:rFonts w:ascii="Courier New" w:cs="Courier New" w:eastAsia="Courier New" w:hAnsi="Courier New"/>
-          <w:sz w:val="17"/>
-          <w:szCs w:val="17"/>
-        </w:rPr>
-        <w:t xml:space="preserve">            }</w:t>
-      </w:r>
-    </w:p>
-    <w:p>
-      <w:pPr>
-        <w:shd w:fill="F2F2F2" w:val="clear"/>
-        <w:spacing w:after="0" w:line="220"/>
-        <w:jc w:val="left"/>
-      </w:pPr>
-      <w:r>
-        <w:rPr>
-          <w:rFonts w:ascii="Courier New" w:cs="Courier New" w:eastAsia="Courier New" w:hAnsi="Courier New"/>
-          <w:sz w:val="17"/>
-          <w:szCs w:val="17"/>
-        </w:rPr>
-        <w:t xml:space="preserve">        }</w:t>
-      </w:r>
-    </w:p>
-    <w:p>
-      <w:pPr>
-        <w:shd w:fill="F2F2F2" w:val="clear"/>
-        <w:spacing w:after="0" w:line="220"/>
-        <w:jc w:val="left"/>
-      </w:pPr>
-      <w:r>
-        <w:rPr>
-          <w:rFonts w:ascii="Courier New" w:cs="Courier New" w:eastAsia="Courier New" w:hAnsi="Courier New"/>
-          <w:sz w:val="17"/>
-          <w:szCs w:val="17"/>
-        </w:rPr>
-        <w:t xml:space="preserve"> </w:t>
+        <w:t xml:space="preserve">        free(v);</w:t>
       </w:r>
     </w:p>
     <w:p>

</xml_diff>

<commit_message>
Encurta as respostas teoricas e a prosa do documento
Mantem o conteudo tecnico e corta repeticao: as doze respostas ficam mais
diretas e as descricoes de solucao passam a ir direto ao ponto. Word
regenerado a partir do texto novo.

Co-Authored-By: Claude Opus 5 <noreply@anthropic.com>
Claude-Session: https://claude.ai/code/session_01KSkkYioErqhAMFwHExuSrw
</commit_message>
<xml_diff>
--- a/atividade-2-pipe/Atividade-2-Pipe.docx
+++ b/atividade-2-pipe/Atividade-2-Pipe.docx
@@ -100,7 +100,7 @@
           <w:sz w:val="24"/>
           <w:szCs w:val="24"/>
         </w:rPr>
-        <w:t xml:space="preserve">O trabalho resolve as duas questões propostas em linguagem C sobre sistemas operacionais Linux. Os programas usam pipe, fork e waitpid, foram compilados com gcc -Wall -Wextra sem avisos e executados para conferência dos resultados. Cada seção traz a descrição da solução, o código fonte, a saída real de execução, a observação dos estados com ps e as respostas das perguntas teóricas.</w:t>
+        <w:t xml:space="preserve">Os dois programas foram escritos em C para Linux e usam pipe, fork e waitpid. Compilam com gcc -Wall -Wextra sem avisos e foram executados para conferir os resultados. Cada questão traz a descrição da solução, o código, a saída da execução, a observação com ps e as respostas.</w:t>
       </w:r>
     </w:p>
     <w:p>
@@ -152,7 +152,7 @@
           <w:sz w:val="24"/>
           <w:szCs w:val="24"/>
         </w:rPr>
-        <w:t xml:space="preserve">O processo pai cria o pipe e executa fork. Em seguida lê do teclado a quantidade N e os N números inteiros, escrevendo cada valor em fd[1]. O filho fecha fd[1], lê de fd[0] até receber EOF, acumula a soma e acompanha o maior e o menor valor a cada leitura. Terminada a leitura, imprime soma, média, maior e menor e encerra com exit(0). O pai fecha fd[0] logo após o fork, fecha fd[1] depois de enviar todos os números e aguarda o filho com waitpid, exibindo o código de saída recebido. Nenhuma variável global é usada para transportar dados. Todas as mensagens identificam o processo e o PID.</w:t>
+        <w:t xml:space="preserve">O pai cria o pipe, faz fork e lê N inteiros do teclado, escrevendo cada um em fd[1]. O filho fecha fd[1], lê de fd[0] até o EOF, calcula soma, média, maior e menor, imprime e sai com exit(0). O pai fecha fd[0] logo após o fork, fecha fd[1] quando termina de enviar e recolhe o filho com waitpid, mostrando o código de saída. Nenhuma variável global transporta dados.</w:t>
       </w:r>
     </w:p>
     <w:p>
@@ -170,7 +170,7 @@
           <w:sz w:val="24"/>
           <w:szCs w:val="24"/>
         </w:rPr>
-        <w:t xml:space="preserve">A chamada fflush(stdout) antes do fork evita que o buffer da saída padrão seja duplicado no filho quando a saída está redirecionada para arquivo ou pipe, situação em que o stdout deixa de ser orientado a linha.</w:t>
+        <w:t xml:space="preserve">O fflush(stdout) antes do fork evita que o buffer da saída padrão seja duplicado no filho quando a saída está redirecionada para arquivo ou pipe.</w:t>
       </w:r>
     </w:p>
     <w:p>
@@ -1880,7 +1880,7 @@
           <w:sz w:val="24"/>
           <w:szCs w:val="24"/>
         </w:rPr>
-        <w:t xml:space="preserve">Durante a digitação, o comando ps -o pid,ppid,stat,cmd -C q1 mostra o pai em S+, bloqueado na entrada padrão, e o filho em S, bloqueado no read do pipe. Depois que o pai fecha fd[1], o filho passa para R enquanto calcula e o pai fica em S dentro do waitpid. Entre o exit do filho e o retorno do waitpid o filho aparece com o estado Z, de processo zumbi.</w:t>
+        <w:t xml:space="preserve">Com ps -o pid,ppid,stat,cmd -C q1 durante a digitação, o pai aparece em S+ esperando o teclado e o filho em S bloqueado no read. Depois que o pai fecha fd[1], o filho passa para R e o pai fica em S no waitpid. O filho aparece como Z entre o exit e o retorno do waitpid.</w:t>
       </w:r>
     </w:p>
     <w:p>
@@ -1931,7 +1931,7 @@
           <w:sz w:val="24"/>
           <w:szCs w:val="24"/>
         </w:rPr>
-        <w:t xml:space="preserve">O read bloqueia quando o buffer do pipe está vazio e ainda existe pelo menos uma ponta de escrita aberta. O write bloqueia quando o buffer está cheio e nenhum leitor consumiu espaço. No programa, o filho fica bloqueado no read desde o fork até o pai enviar o primeiro inteiro, e volta a bloquear entre uma digitação e outra. O pai só bloquearia no write se o volume enviado ultrapassasse a capacidade do buffer, o que não ocorre com poucos inteiros.</w:t>
+        <w:t xml:space="preserve">O read bloqueia com o buffer vazio, desde que ainda exista alguma ponta de escrita aberta. O write bloqueia com o buffer cheio. Aqui o filho fica bloqueado no read entre uma digitação e outra do pai.</w:t>
       </w:r>
     </w:p>
     <w:p>
@@ -1965,7 +1965,7 @@
           <w:sz w:val="24"/>
           <w:szCs w:val="24"/>
         </w:rPr>
-        <w:t xml:space="preserve">O pipe continua com um leitor registrado pelo kernel enquanto o pai existir. O descritor fica vazando até o término do processo e o pai passa a poder ler de volta o que ele mesmo escreveu, consumindo dados destinados ao filho. O descritor desperdiçado tem um segundo efeito: o pai deixa de receber SIGPIPE ou EPIPE caso o filho morra antes da hora, porque a contagem de leitores nunca chega a zero. A falha do consumidor deixa de ser sinalizada e o pai pode bloquear no write quando o buffer encher.</w:t>
+        <w:t xml:space="preserve">O pipe nunca fica sem leitor. O pai pode acabar lendo de volta os dados destinados ao filho, deixa de receber SIGPIPE se o filho morrer antes da hora e ainda vaza o descritor até o fim do processo.</w:t>
       </w:r>
     </w:p>
     <w:p>
@@ -1999,7 +1999,7 @@
           <w:sz w:val="24"/>
           <w:szCs w:val="24"/>
         </w:rPr>
-        <w:t xml:space="preserve">O filho mantém um escritor aberto para o próprio pipe. O EOF só é entregue ao read quando todas as pontas de escrita são fechadas, então, mesmo depois de o pai fechar fd[1], o read do filho não retorna 0. O filho fica bloqueado indefinidamente esperando dados que ninguém enviará, e o pai fica preso no waitpid. É um impasse causado apenas por descritor não fechado.</w:t>
+        <w:t xml:space="preserve">O EOF só chega ao read quando todas as pontas de escrita fecham, e o próprio filho está segurando uma. Ele trava esperando dados que não virão, e o pai fica preso no waitpid.</w:t>
       </w:r>
     </w:p>
     <w:p>
@@ -2033,7 +2033,7 @@
           <w:sz w:val="24"/>
           <w:szCs w:val="24"/>
         </w:rPr>
-        <w:t xml:space="preserve">O buffer tem capacidade finita, 65536 bytes por padrão no Linux. Enquanto o total escrito couber nesse limite, o pai escreve tudo sem bloquear e o filho só precisa ler depois. Quando o volume excede a capacidade, o write bloqueia e a execução passa a alternar entre escritor e leitor, o que torna o programa dependente de o consumidor estar ativo. Um algoritmo que escrevesse todos os dados antes de qualquer leitura funcionaria com N pequeno e travaria com N grande, portanto o tamanho do buffer define o ponto em que o erro de projeto aparece.</w:t>
+        <w:t xml:space="preserve">O buffer tem 65536 bytes por padrão no Linux. Enquanto o total couber nesse limite, o pai escreve tudo sem bloquear. Acima disso o write bloqueia e a execução passa a depender do consumidor: um programa que escrevesse tudo antes de ler funcionaria com N pequeno e travaria com N grande.</w:t>
       </w:r>
     </w:p>
     <w:p>
@@ -2067,7 +2067,7 @@
           <w:sz w:val="24"/>
           <w:szCs w:val="24"/>
         </w:rPr>
-        <w:t xml:space="preserve">A chamada de função executa no mesmo processo, no mesmo espaço de endereçamento e na mesma pilha. Os dados são acessados por endereço e o retorno é imediato, sem intervenção do kernel. Com dois processos existem duas imagens de memória independentes e dois PCBs, e nada é acessível diretamente de um lado para o outro. A transferência exige cópia da memória do escritor para o buffer do kernel e depois para a memória do leitor, somada ao custo de fork, escalonamento e trocas de contexto. O ganho é isolamento de falhas e possibilidade de execução concorrente, o custo é latência e sincronização explícita.</w:t>
+        <w:t xml:space="preserve">A função roda no mesmo espaço de endereçamento, acessa os dados por endereço e retorna direto. Com dois processos existem duas memórias e dois PCBs, e cada valor é copiado para o kernel e de lá para o outro processo, mais o custo de fork e das trocas de contexto. Ganha isolamento, perde desempenho.</w:t>
       </w:r>
     </w:p>
     <w:p>
@@ -2101,7 +2101,7 @@
           <w:sz w:val="24"/>
           <w:szCs w:val="24"/>
         </w:rPr>
-        <w:t xml:space="preserve">Cada processo tem um PCB com PID, PPID, estado, registradores salvos, mapeamento de memória e a tabela de descritores de arquivo. O fork copia o PCB do pai, e a cópia da tabela de descritores faz com que as entradas do filho apontem para as mesmas estruturas de arquivo aberto do kernel, portanto para o mesmo pipe. Quando o read não tem dados, o kernel muda o estado no PCB para bloqueado e coloca o processo na fila de espera do pipe. Quando o pai escreve, o kernel retira o filho dessa fila e o marca como pronto. No fim, o PCB do filho permanece como zumbi guardando o código de saída até o pai recolhê-lo com waitpid.</w:t>
+        <w:t xml:space="preserve">O PCB guarda o estado do processo e a tabela de descritores. O fork copia essa tabela, então pai e filho passam a apontar para o mesmo pipe. Sem dados no read, o kernel marca o PCB como bloqueado e põe o processo na fila de espera do pipe; a escrita do pai o traz de volta para pronto. No fim o PCB do filho fica como zumbi até o waitpid recolher o código de saída.</w:t>
       </w:r>
     </w:p>
     <w:p>
@@ -2158,7 +2158,7 @@
           <w:sz w:val="24"/>
           <w:szCs w:val="24"/>
         </w:rPr>
-        <w:t xml:space="preserve">O processo inicial cria os dois pipes antes de qualquer fork e depois executa duas chamadas a fork. P1, o processo original, abre o arquivo texto e envia cada inteiro lido pelo primeiro pipe. P2 recebe os números, armazena em um vetor que dobra de tamanho com realloc sempre que enche, ordena com qsort e escreve no segundo pipe apenas os valores que diferem do anterior, o que remove as repetições em uma única passagem. Sem esse crescimento, um arquivo maior que a capacidade inicial teria valores descartados e a contagem final sairia menor sem nenhum aviso. P3 conta quantos valores recebeu e imprime o total. Cada processo fecha as pontas que não utiliza, inclusive P3 fechando as duas extremidades do primeiro pipe, sem o que P2 nunca receberia EOF. P1 recolhe os dois filhos com waitpid e informa os códigos de saída.</w:t>
+        <w:t xml:space="preserve">O processo inicial cria os dois pipes e faz dois fork. P1 lê o arquivo e envia os inteiros pelo primeiro pipe. P2 recebe tudo, ordena com qsort, descarta as repetições e manda os valores únicos pelo segundo pipe. P3 conta e imprime o total. Cada processo fecha as pontas que não usa, inclusive P3 fechando as duas extremidades do primeiro pipe, sem o que P2 nunca receberia EOF. O vetor de P2 começa com 1024 posições e dobra com realloc quando enche, então nenhum valor é descartado em silêncio.</w:t>
       </w:r>
     </w:p>
     <w:p>
@@ -4674,7 +4674,7 @@
           <w:sz w:val="24"/>
           <w:szCs w:val="24"/>
         </w:rPr>
-        <w:t xml:space="preserve">Com ps -o pid,ppid,stat,wchan,cmd -C q2 no início da execução, P2 e P3 aparecem em S bloqueados em pipe_read, enquanto P1 lê o arquivo. Ao fechar o primeiro pipe, P2 sai do bloqueio, ordena em R e escreve. P3 continua bloqueado até P2 fechar a ponta de escrita do segundo pipe. Os dois filhos passam pelo estado Z antes de cada waitpid retornar.</w:t>
+        <w:t xml:space="preserve">Com ps -o pid,ppid,stat,wchan,cmd -C q2 no início, P2 e P3 aparecem em S parados em pipe_read enquanto P1 lê o arquivo. Quando P1 fecha o primeiro pipe, P2 sai do bloqueio e escreve. P3 só destrava quando P2 fecha a ponta de escrita do segundo pipe. Os dois filhos passam por Z antes de cada waitpid retornar.</w:t>
       </w:r>
     </w:p>
     <w:p>
@@ -4725,7 +4725,7 @@
           <w:sz w:val="24"/>
           <w:szCs w:val="24"/>
         </w:rPr>
-        <w:t xml:space="preserve">O kernel entrega EOF ao leitor somente quando o número de descritores de escrita do pipe chega a zero. Como o fork duplica todos os descritores, um processo que não escreve ainda assim conta como escritor se não fechar a ponta. Bastaria P3 manter p1[1] aberto para que P2 nunca recebesse EOF e o pipeline travasse. Fechar também libera entradas da tabela de descritores, que é limitada por processo, e permite ao kernel destruir o pipe quando ele deixa de ser referenciado.</w:t>
+        <w:t xml:space="preserve">O EOF só é entregue quando o contador de escritores do pipe zera. Como o fork duplica tudo, um descritor esquecido em processo que nem escreve já segura o pipe aberto. Se P3 não fechasse p1[1], P2 nunca sairia do read.</w:t>
       </w:r>
     </w:p>
     <w:p>
@@ -4759,7 +4759,7 @@
           <w:sz w:val="24"/>
           <w:szCs w:val="24"/>
         </w:rPr>
-        <w:t xml:space="preserve">Ao terminar, o kernel fecha os descritores de P2, e o primeiro pipe fica sem leitores. A próxima escrita de P1 gera SIGPIPE, que por padrão encerra o processo, ou retorna -1 com errno igual a EPIPE se o sinal estiver ignorado. Os bytes ainda presentes no buffer são descartados junto com o pipe. P3 recebe EOF no segundo pipe assim que P2 morre e imprime uma contagem parcial, sem qualquer indicação de erro. O resultado fica incorreto de forma silenciosa, o que reforça a necessidade de verificar o retorno de write e o status devolvido por waitpid.</w:t>
+        <w:t xml:space="preserve">O primeiro pipe fica sem leitor e P1 leva SIGPIPE na escrita seguinte, ou EPIPE se o sinal estiver ignorado. O que estava no buffer se perde e P3 imprime uma contagem parcial sem sinal de erro nenhum.</w:t>
       </w:r>
     </w:p>
     <w:p>
@@ -4793,7 +4793,7 @@
           <w:sz w:val="24"/>
           <w:szCs w:val="24"/>
         </w:rPr>
-        <w:t xml:space="preserve">O read bloqueado funciona como espera por evento gerenciada pelo kernel. O consumidor só volta a executar quando existe dado disponível, e o produtor só para quando o buffer enche. Isso implementa o padrão produtor e consumidor sem semáforo, variável de condição ou espera ocupada. A ordem dos bytes no pipe é preservada, de modo que a sequência de leitura acompanha a sequência de escrita, e o EOF sinaliza o fim do fluxo sem precisar de mensagem de controle no protocolo.</w:t>
+        <w:t xml:space="preserve">É espera por evento feita pelo kernel. O consumidor só executa quando há dado e o produtor para quando o buffer enche, o que dá produtor e consumidor sem semáforo e sem espera ocupada. A ordem dos bytes é preservada e o EOF marca o fim do fluxo.</w:t>
       </w:r>
     </w:p>
     <w:p>
@@ -4827,7 +4827,7 @@
           <w:sz w:val="24"/>
           <w:szCs w:val="24"/>
         </w:rPr>
-        <w:t xml:space="preserve">O programa é o equivalente estrutural de cat dados.txt | sort -u | wc -l. O shell cria um pipe por conexão, faz um fork por comando, usa dup2 para ligar a saída padrão de um processo à ponta de escrita e a entrada padrão do seguinte à ponta de leitura, fecha os descritores restantes e chama exec. A diferença é que aqui não há dup2 nem exec, pois a lógica de cada estágio está no próprio código e a comunicação usa os descritores diretamente. A topologia, o número de processos, o fechamento das pontas e o encerramento em cascata por EOF são os mesmos.</w:t>
+        <w:t xml:space="preserve">Equivale a cat dados.txt | sort -u | wc -l. O shell cria um pipe por conexão e um fork por comando, liga as pontas à entrada e à saída padrão com dup2 e chama exec. Aqui não há dup2 nem exec porque a lógica está no próprio código, mas a topologia e o encerramento em cascata por EOF são os mesmos.</w:t>
       </w:r>
     </w:p>
     <w:p>
@@ -4861,7 +4861,7 @@
           <w:sz w:val="24"/>
           <w:szCs w:val="24"/>
         </w:rPr>
-        <w:t xml:space="preserve">Processos têm espaços de endereçamento separados, portanto os números precisam ser copiados da memória de um para o buffer do kernel e daí para a memória do outro. Threads do mesmo processo compartilham o heap e os descritores, logo o vetor de inteiros seria acessado diretamente, sem cópia e sem pipe, com custo de criação e de troca de contexto bem menor. Em compensação, a sincronização passa a ser responsabilidade do programador, com mutex e variável de condição, e o acesso concorrente admite condição de corrida. O isolamento também desaparece: uma falha de segmentação em uma thread derruba o processo inteiro, enquanto a queda de P2 não afeta a memória de P1 nem de P3.</w:t>
+        <w:t xml:space="preserve">Threads compartilham memória, então o vetor seria acessado direto, sem pipe e sem cópia, com criação bem mais barata. Em troca a sincronização vira responsabilidade do programador, com mutex, e uma falha em qualquer thread derruba o processo inteiro. Com processos há cópia através do kernel, mas as memórias ficam isoladas.</w:t>
       </w:r>
     </w:p>
     <w:p>
@@ -4895,7 +4895,7 @@
           <w:sz w:val="24"/>
           <w:szCs w:val="24"/>
         </w:rPr>
-        <w:t xml:space="preserve">O pipe conecta descritores, não memória. Cada processo mantém PCB próprio com PID, PPID, estado, contexto de registradores, tabela de páginas, credenciais e tabela de descritores. O que existe em comum são apenas as entradas da tabela global de arquivos abertos do kernel referenciadas por essas tabelas, com contadores de referência. Um processo bloqueado em read tem apenas o próprio PCB marcado como bloqueado, sem alterar o estado dos demais, e o escalonador continua tratando os três como entidades separadas. Por isso P3 pode estar bloqueado enquanto P2 executa e P1 já terminou.</w:t>
+        <w:t xml:space="preserve">O pipe liga descritores, não memória. Cada processo tem PCB próprio, com PID, estado, tabela de páginas e tabela de descritores. Em comum ficam apenas as entradas da tabela de arquivos abertos do kernel. Por isso P3 pode estar bloqueado enquanto P2 executa e P1 já terminou.</w:t>
       </w:r>
     </w:p>
     <w:sectPr>

</xml_diff>

<commit_message>
Reduz as respostas para uma ou duas frases
Corta a oracao final que apenas reformulava a ideia ja dita em varias
respostas. Todas passam a ter no maximo duas frases, entre 21 e 40 palavras.

Co-Authored-By: Claude Opus 5 <noreply@anthropic.com>
Claude-Session: https://claude.ai/code/session_01KSkkYioErqhAMFwHExuSrw
</commit_message>
<xml_diff>
--- a/atividade-2-pipe/Atividade-2-Pipe.docx
+++ b/atividade-2-pipe/Atividade-2-Pipe.docx
@@ -79,7 +79,7 @@
           <w:sz w:val="24"/>
           <w:szCs w:val="24"/>
         </w:rPr>
-        <w:t xml:space="preserve">O read bloqueia quando o buffer está vazio e ainda existe alguma ponta de escrita aberta. O write bloqueia quando o buffer está cheio.</w:t>
+        <w:t xml:space="preserve">O read bloqueia com o buffer vazio e alguma ponta de escrita ainda aberta. O write bloqueia com o buffer cheio.</w:t>
       </w:r>
     </w:p>
     <w:p>
@@ -111,7 +111,7 @@
           <w:sz w:val="24"/>
           <w:szCs w:val="24"/>
         </w:rPr>
-        <w:t xml:space="preserve">O pipe fica sempre com um leitor. O pai pode consumir os dados destinados ao filho, deixa de receber SIGPIPE se o filho morrer antes da hora e mantém o descritor aberto até o fim do processo.</w:t>
+        <w:t xml:space="preserve">O pipe nunca fica sem leitor, então o pai não recebe SIGPIPE se o filho morrer e o descritor fica aberto até o fim do processo.</w:t>
       </w:r>
     </w:p>
     <w:p>
@@ -143,7 +143,7 @@
           <w:sz w:val="24"/>
           <w:szCs w:val="24"/>
         </w:rPr>
-        <w:t xml:space="preserve">O read do filho nunca recebe EOF, porque ele mesmo mantém uma ponta de escrita aberta. Ele trava e o pai fica preso no waitpid.</w:t>
+        <w:t xml:space="preserve">O read nunca recebe EOF, porque o próprio filho segura uma ponta de escrita. Ele trava e o pai fica preso no waitpid.</w:t>
       </w:r>
     </w:p>
     <w:p>
@@ -175,7 +175,7 @@
           <w:sz w:val="24"/>
           <w:szCs w:val="24"/>
         </w:rPr>
-        <w:t xml:space="preserve">O buffer tem 65536 bytes no Linux. Se os dados couberem, o pai escreve tudo sem parar. Acima disso o write bloqueia até o filho consumir, e um programa que escrevesse tudo antes de ler entraria em impasse.</w:t>
+        <w:t xml:space="preserve">O buffer tem 65536 bytes no Linux. Enquanto os dados couberem o pai escreve sem parar, acima disso o write bloqueia até o filho consumir.</w:t>
       </w:r>
     </w:p>
     <w:p>
@@ -207,7 +207,7 @@
           <w:sz w:val="24"/>
           <w:szCs w:val="24"/>
         </w:rPr>
-        <w:t xml:space="preserve">A função usa a mesma memória e retorna direto. Dois processos têm memórias e PCBs separados, então cada valor é copiado para o kernel e de lá para o outro processo, com custo de fork e de troca de contexto.</w:t>
+        <w:t xml:space="preserve">A função usa a mesma memória e retorna direto. Dois processos têm memórias separadas, então os dados são copiados através do kernel.</w:t>
       </w:r>
     </w:p>
     <w:p>
@@ -239,7 +239,7 @@
           <w:sz w:val="24"/>
           <w:szCs w:val="24"/>
         </w:rPr>
-        <w:t xml:space="preserve">O PCB guarda o estado do processo e a tabela de descritores, que o fork copia, o que faz pai e filho usarem o mesmo pipe. Sem dados no read, o kernel marca o PCB como bloqueado e o devolve para pronto quando o pai escreve. O PCB do filho fica zumbi até o waitpid recolher o código de saída.</w:t>
+        <w:t xml:space="preserve">O fork copia a tabela de descritores do PCB, o que faz pai e filho usarem o mesmo pipe. O kernel usa o PCB para bloquear o processo no read e para guardar o código de saída até o waitpid.</w:t>
       </w:r>
     </w:p>
     <w:p>
@@ -287,7 +287,7 @@
           <w:sz w:val="24"/>
           <w:szCs w:val="24"/>
         </w:rPr>
-        <w:t xml:space="preserve">O EOF só é entregue quando todas as pontas de escrita estão fechadas. Um descritor esquecido em qualquer processo mantém o pipe aberto e trava o leitor.</w:t>
+        <w:t xml:space="preserve">O EOF só chega quando todas as pontas de escrita estão fechadas. Um descritor esquecido em qualquer processo trava o leitor.</w:t>
       </w:r>
     </w:p>
     <w:p>
@@ -319,7 +319,7 @@
           <w:sz w:val="24"/>
           <w:szCs w:val="24"/>
         </w:rPr>
-        <w:t xml:space="preserve">O pipe fica sem leitor e o processo anterior recebe SIGPIPE na escrita seguinte, ou EPIPE se o sinal estiver ignorado. Os dados que estavam no buffer se perdem e o último processo imprime uma contagem parcial.</w:t>
+        <w:t xml:space="preserve">O pipe fica sem leitor e o processo anterior recebe SIGPIPE na escrita seguinte, ou EPIPE se o sinal estiver ignorado. O último processo imprime uma contagem parcial.</w:t>
       </w:r>
     </w:p>
     <w:p>
@@ -351,7 +351,7 @@
           <w:sz w:val="24"/>
           <w:szCs w:val="24"/>
         </w:rPr>
-        <w:t xml:space="preserve">O consumidor só executa quando existe dado e o produtor para quando o buffer enche. Isso sincroniza os processos sem semáforo e sem espera ocupada.</w:t>
+        <w:t xml:space="preserve">O consumidor só executa quando há dado e o produtor para quando o buffer enche. Isso sincroniza os processos sem semáforo.</w:t>
       </w:r>
     </w:p>
     <w:p>
@@ -383,7 +383,7 @@
           <w:sz w:val="24"/>
           <w:szCs w:val="24"/>
         </w:rPr>
-        <w:t xml:space="preserve">É o mesmo que cat dados.txt | sort -u | wc -l. O shell cria um pipe por conexão e um fork por comando, liga as pontas à entrada e à saída padrão com dup2 e chama exec.</w:t>
+        <w:t xml:space="preserve">É o mesmo que cat dados.txt | sort -u | wc -l. O shell cria um pipe por conexão, um fork por comando, liga as pontas com dup2 e chama exec.</w:t>
       </w:r>
     </w:p>
     <w:p>
@@ -415,7 +415,7 @@
           <w:sz w:val="24"/>
           <w:szCs w:val="24"/>
         </w:rPr>
-        <w:t xml:space="preserve">Threads compartilham memória e dispensam pipe e cópia, mas exigem mutex e uma falha derruba o processo inteiro. Processos copiam os dados através do kernel e mantêm as memórias isoladas.</w:t>
+        <w:t xml:space="preserve">Threads compartilham memória e dispensam o pipe, mas exigem mutex e uma falha derruba o processo inteiro. Processos copiam pelo kernel e mantêm as memórias isoladas.</w:t>
       </w:r>
     </w:p>
     <w:p>
@@ -447,7 +447,7 @@
           <w:sz w:val="24"/>
           <w:szCs w:val="24"/>
         </w:rPr>
-        <w:t xml:space="preserve">O pipe liga descritores, não memória. Cada processo tem PCB próprio, com PID, estado e tabela de descritores, e só as entradas da tabela de arquivos abertos do kernel são comuns aos três.</w:t>
+        <w:t xml:space="preserve">O pipe liga descritores, não memória. Cada processo tem PCB próprio e só as entradas da tabela de arquivos abertos do kernel são comuns.</w:t>
       </w:r>
     </w:p>
     <w:sectPr>

</xml_diff>